<commit_message>
Documents: read spacing and other paragraph properties on list levels (#69)
A numbering level's pPr may carry spacing, alignment, keep/widow/page-break
flags, shading, borders and mirrored-indent/suppression flags. These now join
the list paragraph's cascade at the level's position, replacing the
border-only handling: below the paragraph style for style-applied numbering,
above it for direct numbering, and below direct properties and edits. Each
property, spacing group and border side resolves independently. List
definitions derived from an imported level re-emit its declared properties
in CT_PPrBase order.

The read-only preview no longer drops a whole list (its bullets and indents)
when a level carries a still-unsupported paragraph property: it reports and
ignores only that property.
</commit_message>
<xml_diff>
--- a/src/documents/tests/fixtures/list-borders-retained-links/combined.docx
+++ b/src/documents/tests/fixtures/list-borders-retained-links/combined.docx
@@ -38,6 +38,7 @@
         <w:pBdr>
           <w:bottom w:val="nil"/>
         </w:pBdr>
+        <w:spacing w:after="0"/>
       </w:pPr>
       <w:r>
         <w:t xml:space="preserve">Direct border override</w:t>
@@ -140,6 +141,7 @@
         <w:pBdr>
           <w:bottom w:val="single" w:sz="6" w:space="1" w:color="2F5496"/>
         </w:pBdr>
+        <w:spacing w:before="120" w:after="60" w:line="360" w:lineRule="auto"/>
         <w:ind w:left="720" w:hanging="360"/>
       </w:pPr>
     </w:lvl>
@@ -153,6 +155,7 @@
           <w:left w:val="double" w:sz="12" w:space="4" w:color="C00000"/>
         </w:pBdr>
         <w:ind w:left="1440" w:hanging="360"/>
+        <w:jc w:val="center"/>
       </w:pPr>
     </w:lvl>
   </w:abstractNum>
@@ -164,10 +167,12 @@
       <w:lvlText w:val="%1."/>
       <w:lvlJc w:val="left"/>
       <w:pPr>
+        <w:keepNext/>
         <w:pBdr>
           <w:left w:val="single" w:sz="8" w:space="4" w:color="00B050"/>
           <w:bottom w:val="dotted" w:sz="4" w:space="1" w:color="00B050"/>
         </w:pBdr>
+        <w:spacing w:before="240" w:after="240"/>
         <w:ind w:left="720" w:hanging="360"/>
       </w:pPr>
     </w:lvl>
@@ -196,6 +201,7 @@
       <w:pBdr>
         <w:left w:val="single" w:sz="4" w:space="4" w:color="000000"/>
       </w:pBdr>
+      <w:spacing w:before="0"/>
     </w:pPr>
   </w:style>
 </w:styles>

</xml_diff>